<commit_message>
paper6: final pre-submission manuscript.docx (DOI + journal)
</commit_message>
<xml_diff>
--- a/manuscript/paper6/manuscript.docx
+++ b/manuscript/paper6/manuscript.docx
@@ -4719,7 +4719,7 @@
           <w:color w:val="000000"/>
           <w:sz w:val="24"/>
         </w:rPr>
-        <w:t xml:space="preserve"> https://github.com/linfuxing123/IL-Property-ML (version DOI</w:t>
+        <w:t xml:space="preserve"> https://github.com/linfuxing123/IL-Property-ML, release v2.0.0</w:t>
       </w:r>
     </w:p>
     <w:p>
@@ -4731,7 +4731,7 @@
           <w:color w:val="000000"/>
           <w:sz w:val="24"/>
         </w:rPr>
-        <w:t>10.5281/zenodo.XXXXXXX after release).</w:t>
+        <w:t>(https://doi.org/10.5281/zenodo.21941054).</w:t>
       </w:r>
     </w:p>
     <w:p>
@@ -5083,7 +5083,7 @@
           <w:color w:val="000000"/>
           <w:sz w:val="24"/>
         </w:rPr>
-        <w:t>Data and code are publicly available at</w:t>
+        <w:t>All data, code, models, and the manuscript are publicly available at</w:t>
       </w:r>
     </w:p>
     <w:p>
@@ -5095,7 +5095,7 @@
           <w:color w:val="000000"/>
           <w:sz w:val="24"/>
         </w:rPr>
-        <w:t>https://github.com/linfuxing123/IL-Property-ML (version DOI</w:t>
+        <w:t>https://github.com/linfuxing123/IL-Property-ML (release v2.0.0, archived at</w:t>
       </w:r>
     </w:p>
     <w:p>
@@ -5107,7 +5107,7 @@
           <w:color w:val="000000"/>
           <w:sz w:val="24"/>
         </w:rPr>
-        <w:t>10.5281/zenodo.XXXXXXX). Underlying sources: ILThermo v2.0 (NIST); Mendeley</w:t>
+        <w:t>https://doi.org/10.5281/zenodo.21941054). The archive contains the merged</w:t>
       </w:r>
     </w:p>
     <w:p>
@@ -5119,7 +5119,7 @@
           <w:color w:val="000000"/>
           <w:sz w:val="24"/>
         </w:rPr>
-        <w:t>tpp25ztzmb [4]; Zenodo 7935198 (ILTransR), 14601320/15046370 (ILBERT), 3251661</w:t>
+        <w:t>experimental dataset (6,177 unique ILs), the ion-identity lists derived from the</w:t>
       </w:r>
     </w:p>
     <w:p>
@@ -5131,7 +5131,43 @@
           <w:color w:val="000000"/>
           <w:sz w:val="24"/>
         </w:rPr>
-        <w:t>(ILPE).</w:t>
+        <w:t>8.33M-IL virtual space, all descriptor tables, the eight trained predictor models</w:t>
+      </w:r>
+    </w:p>
+    <w:p>
+      <w:r>
+        <w:rPr>
+          <w:rFonts w:ascii="Times New Roman" w:hAnsi="Times New Roman" w:eastAsia="宋体"/>
+          <w:b w:val="0"/>
+          <w:i w:val="0"/>
+          <w:color w:val="000000"/>
+          <w:sz w:val="24"/>
+        </w:rPr>
+        <w:t>(GBM/HistGBM × four properties), all scripts, and this manuscript with its</w:t>
+      </w:r>
+    </w:p>
+    <w:p>
+      <w:r>
+        <w:rPr>
+          <w:rFonts w:ascii="Times New Roman" w:hAnsi="Times New Roman" w:eastAsia="宋体"/>
+          <w:b w:val="0"/>
+          <w:i w:val="0"/>
+          <w:color w:val="000000"/>
+          <w:sz w:val="24"/>
+        </w:rPr>
+        <w:t>figures. Underlying public sources: ILThermo v2.0 (NIST); Mendeley tpp25ztzmb</w:t>
+      </w:r>
+    </w:p>
+    <w:p>
+      <w:r>
+        <w:rPr>
+          <w:rFonts w:ascii="Times New Roman" w:hAnsi="Times New Roman" w:eastAsia="宋体"/>
+          <w:b w:val="0"/>
+          <w:i w:val="0"/>
+          <w:color w:val="000000"/>
+          <w:sz w:val="24"/>
+        </w:rPr>
+        <w:t>[4]; Zenodo 7935198 (ILTransR), 14601320/15046370 (ILBERT), 3251661 (ILPE).</w:t>
       </w:r>
     </w:p>
     <w:p>

</xml_diff>